<commit_message>
Magazin: lista de produse cu cautare, filtre, sortare si paginare, pagina produsului, cos virtual, comanda, ocazii, livrare, contact
</commit_message>
<xml_diff>
--- a/docs/documentatie.docx
+++ b/docs/documentatie.docx
@@ -65,15 +65,15 @@
         </w:tblCellMar>
       </w:tblPr>
       <w:tblGrid>
-        <w:gridCol w:w="2197"/>
-        <w:gridCol w:w="1347"/>
-        <w:gridCol w:w="7795"/>
+        <w:gridCol w:w="2239"/>
+        <w:gridCol w:w="1494"/>
+        <w:gridCol w:w="7606"/>
       </w:tblGrid>
       <w:tr>
         <w:trPr/>
         <w:tc>
           <w:tcPr>
-            <w:tcW w:w="2197" w:type="dxa"/>
+            <w:tcW w:w="2239" w:type="dxa"/>
             <w:tcBorders/>
             <w:vAlign w:val="center"/>
           </w:tcPr>
@@ -94,7 +94,7 @@
         </w:tc>
         <w:tc>
           <w:tcPr>
-            <w:tcW w:w="1347" w:type="dxa"/>
+            <w:tcW w:w="1494" w:type="dxa"/>
             <w:tcBorders/>
             <w:vAlign w:val="center"/>
           </w:tcPr>
@@ -115,7 +115,7 @@
         </w:tc>
         <w:tc>
           <w:tcPr>
-            <w:tcW w:w="7795" w:type="dxa"/>
+            <w:tcW w:w="7606" w:type="dxa"/>
             <w:tcBorders/>
             <w:vAlign w:val="center"/>
           </w:tcPr>
@@ -139,7 +139,7 @@
         <w:trPr/>
         <w:tc>
           <w:tcPr>
-            <w:tcW w:w="2197" w:type="dxa"/>
+            <w:tcW w:w="2239" w:type="dxa"/>
             <w:tcBorders/>
             <w:vAlign w:val="center"/>
           </w:tcPr>
@@ -158,7 +158,7 @@
         </w:tc>
         <w:tc>
           <w:tcPr>
-            <w:tcW w:w="1347" w:type="dxa"/>
+            <w:tcW w:w="1494" w:type="dxa"/>
             <w:tcBorders/>
             <w:vAlign w:val="center"/>
           </w:tcPr>
@@ -177,7 +177,7 @@
         </w:tc>
         <w:tc>
           <w:tcPr>
-            <w:tcW w:w="7795" w:type="dxa"/>
+            <w:tcW w:w="7606" w:type="dxa"/>
             <w:tcBorders/>
             <w:vAlign w:val="center"/>
           </w:tcPr>
@@ -199,7 +199,7 @@
         <w:trPr/>
         <w:tc>
           <w:tcPr>
-            <w:tcW w:w="2197" w:type="dxa"/>
+            <w:tcW w:w="2239" w:type="dxa"/>
             <w:tcBorders/>
             <w:vAlign w:val="center"/>
           </w:tcPr>
@@ -218,7 +218,7 @@
         </w:tc>
         <w:tc>
           <w:tcPr>
-            <w:tcW w:w="1347" w:type="dxa"/>
+            <w:tcW w:w="1494" w:type="dxa"/>
             <w:tcBorders/>
             <w:vAlign w:val="center"/>
           </w:tcPr>
@@ -237,7 +237,7 @@
         </w:tc>
         <w:tc>
           <w:tcPr>
-            <w:tcW w:w="7795" w:type="dxa"/>
+            <w:tcW w:w="7606" w:type="dxa"/>
             <w:tcBorders/>
             <w:vAlign w:val="center"/>
           </w:tcPr>
@@ -259,7 +259,7 @@
         <w:trPr/>
         <w:tc>
           <w:tcPr>
-            <w:tcW w:w="2197" w:type="dxa"/>
+            <w:tcW w:w="2239" w:type="dxa"/>
             <w:tcBorders/>
             <w:vAlign w:val="center"/>
           </w:tcPr>
@@ -278,7 +278,7 @@
         </w:tc>
         <w:tc>
           <w:tcPr>
-            <w:tcW w:w="1347" w:type="dxa"/>
+            <w:tcW w:w="1494" w:type="dxa"/>
             <w:tcBorders/>
             <w:vAlign w:val="center"/>
           </w:tcPr>
@@ -297,7 +297,7 @@
         </w:tc>
         <w:tc>
           <w:tcPr>
-            <w:tcW w:w="7795" w:type="dxa"/>
+            <w:tcW w:w="7606" w:type="dxa"/>
             <w:tcBorders/>
             <w:vAlign w:val="center"/>
           </w:tcPr>
@@ -319,7 +319,7 @@
         <w:trPr/>
         <w:tc>
           <w:tcPr>
-            <w:tcW w:w="2197" w:type="dxa"/>
+            <w:tcW w:w="2239" w:type="dxa"/>
             <w:tcBorders/>
             <w:vAlign w:val="center"/>
           </w:tcPr>
@@ -338,7 +338,7 @@
         </w:tc>
         <w:tc>
           <w:tcPr>
-            <w:tcW w:w="1347" w:type="dxa"/>
+            <w:tcW w:w="1494" w:type="dxa"/>
             <w:tcBorders/>
             <w:vAlign w:val="center"/>
           </w:tcPr>
@@ -357,20 +357,20 @@
         </w:tc>
         <w:tc>
           <w:tcPr>
-            <w:tcW w:w="7795" w:type="dxa"/>
-            <w:tcBorders/>
-            <w:vAlign w:val="center"/>
-          </w:tcPr>
-          <w:p>
-            <w:pPr>
-              <w:pStyle w:val="TableContents"/>
-              <w:bidi w:val="0"/>
-              <w:spacing w:before="0" w:after="283"/>
-              <w:rPr/>
-            </w:pPr>
-            <w:r>
-              <w:rPr/>
-              <w:t>Lista florilor, cu filtrare, sortare și paginare (va fi implementată într-un laborator următor).</w:t>
+            <w:tcW w:w="7606" w:type="dxa"/>
+            <w:tcBorders/>
+            <w:vAlign w:val="center"/>
+          </w:tcPr>
+          <w:p>
+            <w:pPr>
+              <w:pStyle w:val="TableContents"/>
+              <w:bidi w:val="0"/>
+              <w:spacing w:before="0" w:after="283"/>
+              <w:rPr/>
+            </w:pPr>
+            <w:r>
+              <w:rPr/>
+              <w:t>Lista florilor, cu căutare, filtre (categorie, ocazie, tip, preț, stoc), sortare și paginare.</w:t>
             </w:r>
           </w:p>
         </w:tc>
@@ -379,58 +379,58 @@
         <w:trPr/>
         <w:tc>
           <w:tcPr>
-            <w:tcW w:w="2197" w:type="dxa"/>
-            <w:tcBorders/>
-            <w:vAlign w:val="center"/>
-          </w:tcPr>
-          <w:p>
-            <w:pPr>
-              <w:pStyle w:val="TableContents"/>
-              <w:bidi w:val="0"/>
-              <w:spacing w:before="0" w:after="283"/>
-              <w:rPr/>
-            </w:pPr>
-            <w:r>
-              <w:rPr/>
-              <w:t>Contact</w:t>
-            </w:r>
-          </w:p>
-        </w:tc>
-        <w:tc>
-          <w:tcPr>
-            <w:tcW w:w="1347" w:type="dxa"/>
-            <w:tcBorders/>
-            <w:vAlign w:val="center"/>
-          </w:tcPr>
-          <w:p>
-            <w:pPr>
-              <w:pStyle w:val="TableContents"/>
-              <w:bidi w:val="0"/>
-              <w:spacing w:before="0" w:after="283"/>
-              <w:rPr/>
-            </w:pPr>
-            <w:r>
-              <w:rPr/>
-              <w:t>/contact</w:t>
-            </w:r>
-          </w:p>
-        </w:tc>
-        <w:tc>
-          <w:tcPr>
-            <w:tcW w:w="7795" w:type="dxa"/>
-            <w:tcBorders/>
-            <w:vAlign w:val="center"/>
-          </w:tcPr>
-          <w:p>
-            <w:pPr>
-              <w:pStyle w:val="TableContents"/>
-              <w:bidi w:val="0"/>
-              <w:spacing w:before="0" w:after="283"/>
-              <w:rPr/>
-            </w:pPr>
-            <w:r>
-              <w:rPr/>
-              <w:t>Formular de contact (va fi implementată într-un laborator următor).</w:t>
+            <w:tcW w:w="2239" w:type="dxa"/>
+            <w:tcBorders/>
+            <w:vAlign w:val="center"/>
+          </w:tcPr>
+          <w:p>
+            <w:pPr>
+              <w:pStyle w:val="TableContents"/>
+              <w:bidi w:val="0"/>
+              <w:spacing w:before="0" w:after="283"/>
+              <w:rPr/>
+            </w:pPr>
+            <w:r>
+              <w:rPr/>
+              <w:t>Pagina produsului</w:t>
+            </w:r>
+          </w:p>
+        </w:tc>
+        <w:tc>
+          <w:tcPr>
+            <w:tcW w:w="1494" w:type="dxa"/>
+            <w:tcBorders/>
+            <w:vAlign w:val="center"/>
+          </w:tcPr>
+          <w:p>
+            <w:pPr>
+              <w:pStyle w:val="TableContents"/>
+              <w:bidi w:val="0"/>
+              <w:spacing w:before="0" w:after="283"/>
+              <w:rPr/>
+            </w:pPr>
+            <w:r>
+              <w:rPr/>
+              <w:t>/produse/[slug]</w:t>
+            </w:r>
+          </w:p>
+        </w:tc>
+        <w:tc>
+          <w:tcPr>
+            <w:tcW w:w="7606" w:type="dxa"/>
+            <w:tcBorders/>
+            <w:vAlign w:val="center"/>
+          </w:tcPr>
+          <w:p>
+            <w:pPr>
+              <w:pStyle w:val="TableContents"/>
+              <w:bidi w:val="0"/>
+              <w:spacing w:before="0" w:after="283"/>
+              <w:rPr/>
+            </w:pPr>
+            <w:r>
+              <w:rPr/>
+              <w:t>Detaliile unei flori și adăugarea în coș.</w:t>
             </w:r>
           </w:p>
         </w:tc>
@@ -439,58 +439,58 @@
         <w:trPr/>
         <w:tc>
           <w:tcPr>
-            <w:tcW w:w="2197" w:type="dxa"/>
-            <w:tcBorders/>
-            <w:vAlign w:val="center"/>
-          </w:tcPr>
-          <w:p>
-            <w:pPr>
-              <w:pStyle w:val="TableContents"/>
-              <w:bidi w:val="0"/>
-              <w:spacing w:before="0" w:after="283"/>
-              <w:rPr/>
-            </w:pPr>
-            <w:r>
-              <w:rPr/>
-              <w:t>Coș virtual</w:t>
-            </w:r>
-          </w:p>
-        </w:tc>
-        <w:tc>
-          <w:tcPr>
-            <w:tcW w:w="1347" w:type="dxa"/>
-            <w:tcBorders/>
-            <w:vAlign w:val="center"/>
-          </w:tcPr>
-          <w:p>
-            <w:pPr>
-              <w:pStyle w:val="TableContents"/>
-              <w:bidi w:val="0"/>
-              <w:spacing w:before="0" w:after="283"/>
-              <w:rPr/>
-            </w:pPr>
-            <w:r>
-              <w:rPr/>
-              <w:t>/cos_virtual</w:t>
-            </w:r>
-          </w:p>
-        </w:tc>
-        <w:tc>
-          <w:tcPr>
-            <w:tcW w:w="7795" w:type="dxa"/>
-            <w:tcBorders/>
-            <w:vAlign w:val="center"/>
-          </w:tcPr>
-          <w:p>
-            <w:pPr>
-              <w:pStyle w:val="TableContents"/>
-              <w:bidi w:val="0"/>
-              <w:spacing w:before="0" w:after="283"/>
-              <w:rPr/>
-            </w:pPr>
-            <w:r>
-              <w:rPr/>
-              <w:t>Produsele alese de client și plasarea comenzii (va fi implementată într-un laborator următor).</w:t>
+            <w:tcW w:w="2239" w:type="dxa"/>
+            <w:tcBorders/>
+            <w:vAlign w:val="center"/>
+          </w:tcPr>
+          <w:p>
+            <w:pPr>
+              <w:pStyle w:val="TableContents"/>
+              <w:bidi w:val="0"/>
+              <w:spacing w:before="0" w:after="283"/>
+              <w:rPr/>
+            </w:pPr>
+            <w:r>
+              <w:rPr/>
+              <w:t>Contact</w:t>
+            </w:r>
+          </w:p>
+        </w:tc>
+        <w:tc>
+          <w:tcPr>
+            <w:tcW w:w="1494" w:type="dxa"/>
+            <w:tcBorders/>
+            <w:vAlign w:val="center"/>
+          </w:tcPr>
+          <w:p>
+            <w:pPr>
+              <w:pStyle w:val="TableContents"/>
+              <w:bidi w:val="0"/>
+              <w:spacing w:before="0" w:after="283"/>
+              <w:rPr/>
+            </w:pPr>
+            <w:r>
+              <w:rPr/>
+              <w:t>/contact</w:t>
+            </w:r>
+          </w:p>
+        </w:tc>
+        <w:tc>
+          <w:tcPr>
+            <w:tcW w:w="7606" w:type="dxa"/>
+            <w:tcBorders/>
+            <w:vAlign w:val="center"/>
+          </w:tcPr>
+          <w:p>
+            <w:pPr>
+              <w:pStyle w:val="TableContents"/>
+              <w:bidi w:val="0"/>
+              <w:spacing w:before="0" w:after="283"/>
+              <w:rPr/>
+            </w:pPr>
+            <w:r>
+              <w:rPr/>
+              <w:t>Formular de contact, cu validare.</w:t>
             </w:r>
           </w:p>
         </w:tc>
@@ -499,7 +499,127 @@
         <w:trPr/>
         <w:tc>
           <w:tcPr>
-            <w:tcW w:w="2197" w:type="dxa"/>
+            <w:tcW w:w="2239" w:type="dxa"/>
+            <w:tcBorders/>
+            <w:vAlign w:val="center"/>
+          </w:tcPr>
+          <w:p>
+            <w:pPr>
+              <w:pStyle w:val="TableContents"/>
+              <w:bidi w:val="0"/>
+              <w:spacing w:before="0" w:after="283"/>
+              <w:rPr/>
+            </w:pPr>
+            <w:r>
+              <w:rPr/>
+              <w:t>Coș virtual</w:t>
+            </w:r>
+          </w:p>
+        </w:tc>
+        <w:tc>
+          <w:tcPr>
+            <w:tcW w:w="1494" w:type="dxa"/>
+            <w:tcBorders/>
+            <w:vAlign w:val="center"/>
+          </w:tcPr>
+          <w:p>
+            <w:pPr>
+              <w:pStyle w:val="TableContents"/>
+              <w:bidi w:val="0"/>
+              <w:spacing w:before="0" w:after="283"/>
+              <w:rPr/>
+            </w:pPr>
+            <w:r>
+              <w:rPr/>
+              <w:t>/cos_virtual</w:t>
+            </w:r>
+          </w:p>
+        </w:tc>
+        <w:tc>
+          <w:tcPr>
+            <w:tcW w:w="7606" w:type="dxa"/>
+            <w:tcBorders/>
+            <w:vAlign w:val="center"/>
+          </w:tcPr>
+          <w:p>
+            <w:pPr>
+              <w:pStyle w:val="TableContents"/>
+              <w:bidi w:val="0"/>
+              <w:spacing w:before="0" w:after="283"/>
+              <w:rPr/>
+            </w:pPr>
+            <w:r>
+              <w:rPr/>
+              <w:t>Produsele alese de client (modificare cantități, ștergere) și plasarea comenzii.</w:t>
+            </w:r>
+          </w:p>
+        </w:tc>
+      </w:tr>
+      <w:tr>
+        <w:trPr/>
+        <w:tc>
+          <w:tcPr>
+            <w:tcW w:w="2239" w:type="dxa"/>
+            <w:tcBorders/>
+            <w:vAlign w:val="center"/>
+          </w:tcPr>
+          <w:p>
+            <w:pPr>
+              <w:pStyle w:val="TableContents"/>
+              <w:bidi w:val="0"/>
+              <w:spacing w:before="0" w:after="283"/>
+              <w:rPr/>
+            </w:pPr>
+            <w:r>
+              <w:rPr/>
+              <w:t>Confirmarea comenzii</w:t>
+            </w:r>
+          </w:p>
+        </w:tc>
+        <w:tc>
+          <w:tcPr>
+            <w:tcW w:w="1494" w:type="dxa"/>
+            <w:tcBorders/>
+            <w:vAlign w:val="center"/>
+          </w:tcPr>
+          <w:p>
+            <w:pPr>
+              <w:pStyle w:val="TableContents"/>
+              <w:bidi w:val="0"/>
+              <w:spacing w:before="0" w:after="283"/>
+              <w:rPr/>
+            </w:pPr>
+            <w:r>
+              <w:rPr/>
+              <w:t>/comanda/[id]</w:t>
+            </w:r>
+          </w:p>
+        </w:tc>
+        <w:tc>
+          <w:tcPr>
+            <w:tcW w:w="7606" w:type="dxa"/>
+            <w:tcBorders/>
+            <w:vAlign w:val="center"/>
+          </w:tcPr>
+          <w:p>
+            <w:pPr>
+              <w:pStyle w:val="TableContents"/>
+              <w:bidi w:val="0"/>
+              <w:spacing w:before="0" w:after="283"/>
+              <w:rPr/>
+            </w:pPr>
+            <w:r>
+              <w:rPr/>
+              <w:t>Rezumatul comenzii plasate.</w:t>
+            </w:r>
+          </w:p>
+        </w:tc>
+      </w:tr>
+      <w:tr>
+        <w:trPr/>
+        <w:tc>
+          <w:tcPr>
+            <w:tcW w:w="2239" w:type="dxa"/>
             <w:tcBorders/>
             <w:vAlign w:val="center"/>
           </w:tcPr>
@@ -524,7 +644,7 @@
         </w:tc>
         <w:tc>
           <w:tcPr>
-            <w:tcW w:w="1347" w:type="dxa"/>
+            <w:tcW w:w="1494" w:type="dxa"/>
             <w:tcBorders/>
             <w:vAlign w:val="center"/>
           </w:tcPr>
@@ -543,7 +663,7 @@
         </w:tc>
         <w:tc>
           <w:tcPr>
-            <w:tcW w:w="7795" w:type="dxa"/>
+            <w:tcW w:w="7606" w:type="dxa"/>
             <w:tcBorders/>
             <w:vAlign w:val="center"/>
           </w:tcPr>
@@ -565,7 +685,7 @@
         <w:trPr/>
         <w:tc>
           <w:tcPr>
-            <w:tcW w:w="2197" w:type="dxa"/>
+            <w:tcW w:w="2239" w:type="dxa"/>
             <w:tcBorders/>
             <w:vAlign w:val="center"/>
           </w:tcPr>
@@ -590,7 +710,7 @@
         </w:tc>
         <w:tc>
           <w:tcPr>
-            <w:tcW w:w="1347" w:type="dxa"/>
+            <w:tcW w:w="1494" w:type="dxa"/>
             <w:tcBorders/>
             <w:vAlign w:val="center"/>
           </w:tcPr>
@@ -609,7 +729,7 @@
         </w:tc>
         <w:tc>
           <w:tcPr>
-            <w:tcW w:w="7795" w:type="dxa"/>
+            <w:tcW w:w="7606" w:type="dxa"/>
             <w:tcBorders/>
             <w:vAlign w:val="center"/>
           </w:tcPr>
@@ -631,7 +751,7 @@
         <w:trPr/>
         <w:tc>
           <w:tcPr>
-            <w:tcW w:w="2197" w:type="dxa"/>
+            <w:tcW w:w="2239" w:type="dxa"/>
             <w:tcBorders/>
             <w:vAlign w:val="center"/>
           </w:tcPr>
@@ -650,7 +770,7 @@
         </w:tc>
         <w:tc>
           <w:tcPr>
-            <w:tcW w:w="1347" w:type="dxa"/>
+            <w:tcW w:w="1494" w:type="dxa"/>
             <w:tcBorders/>
             <w:vAlign w:val="center"/>
           </w:tcPr>
@@ -669,7 +789,7 @@
         </w:tc>
         <w:tc>
           <w:tcPr>
-            <w:tcW w:w="7795" w:type="dxa"/>
+            <w:tcW w:w="7606" w:type="dxa"/>
             <w:tcBorders/>
             <w:vAlign w:val="center"/>
           </w:tcPr>
@@ -711,7 +831,7 @@
         <w:trPr/>
         <w:tc>
           <w:tcPr>
-            <w:tcW w:w="2197" w:type="dxa"/>
+            <w:tcW w:w="2239" w:type="dxa"/>
             <w:tcBorders/>
             <w:vAlign w:val="center"/>
           </w:tcPr>
@@ -730,7 +850,7 @@
         </w:tc>
         <w:tc>
           <w:tcPr>
-            <w:tcW w:w="1347" w:type="dxa"/>
+            <w:tcW w:w="1494" w:type="dxa"/>
             <w:tcBorders/>
             <w:vAlign w:val="center"/>
           </w:tcPr>
@@ -749,7 +869,7 @@
         </w:tc>
         <w:tc>
           <w:tcPr>
-            <w:tcW w:w="7795" w:type="dxa"/>
+            <w:tcW w:w="7606" w:type="dxa"/>
             <w:tcBorders/>
             <w:vAlign w:val="center"/>
           </w:tcPr>
@@ -821,7 +941,7 @@
         <w:trPr/>
         <w:tc>
           <w:tcPr>
-            <w:tcW w:w="2197" w:type="dxa"/>
+            <w:tcW w:w="2239" w:type="dxa"/>
             <w:tcBorders/>
             <w:vAlign w:val="center"/>
           </w:tcPr>
@@ -840,7 +960,7 @@
         </w:tc>
         <w:tc>
           <w:tcPr>
-            <w:tcW w:w="1347" w:type="dxa"/>
+            <w:tcW w:w="1494" w:type="dxa"/>
             <w:tcBorders/>
             <w:vAlign w:val="center"/>
           </w:tcPr>
@@ -859,7 +979,7 @@
         </w:tc>
         <w:tc>
           <w:tcPr>
-            <w:tcW w:w="7795" w:type="dxa"/>
+            <w:tcW w:w="7606" w:type="dxa"/>
             <w:tcBorders/>
             <w:vAlign w:val="center"/>
           </w:tcPr>
@@ -886,7 +1006,7 @@
       </w:pPr>
       <w:r>
         <w:rPr/>
-        <w:t>Paginile care nu sunt încă implementate afișează template-ul „In lucru”.</w:t>
+        <w:t>Template-ul „In lucru” (cerut în laboratorul 2) a fost folosit pentru paginile care nu erau încă implementate; acum toate paginile din meniu au conținut.</w:t>
       </w:r>
     </w:p>
     <w:p>
@@ -1481,7 +1601,18 @@
       </w:pPr>
       <w:r>
         <w:rPr/>
-        <w:t>3. Rularea proiectului</w:t>
+        <w:t>3. Comenzi</w:t>
+      </w:r>
+    </w:p>
+    <w:p>
+      <w:pPr>
+        <w:pStyle w:val="BodyText"/>
+        <w:bidi w:val="0"/>
+        <w:rPr/>
+      </w:pPr>
+      <w:r>
+        <w:rPr/>
+        <w:t>După laboratorul 3 am adăugat entitățile legate de client, necesare coșului virtual:</w:t>
       </w:r>
     </w:p>
     <w:p>
@@ -1502,6 +1633,92 @@
       </w:pPr>
       <w:r>
         <w:rPr>
+          <w:b/>
+        </w:rPr>
+        <w:t>Comanda</w:t>
+      </w:r>
+      <w:r>
+        <w:rPr/>
+        <w:t xml:space="preserve"> - nume client, e-mail, telefon, adresa de livrare, observații, stare (nouă, în livrare, livrată, anulată), data plasării. </w:t>
+      </w:r>
+    </w:p>
+    <w:p>
+      <w:pPr>
+        <w:pStyle w:val="BodyText"/>
+        <w:numPr>
+          <w:ilvl w:val="0"/>
+          <w:numId w:val="4"/>
+        </w:numPr>
+        <w:tabs>
+          <w:tab w:val="clear" w:pos="1134"/>
+          <w:tab w:val="left" w:pos="709" w:leader="none"/>
+        </w:tabs>
+        <w:bidi w:val="0"/>
+        <w:ind w:hanging="283" w:left="709"/>
+        <w:rPr/>
+      </w:pPr>
+      <w:r>
+        <w:rPr>
+          <w:b/>
+        </w:rPr>
+        <w:t>LinieComanda</w:t>
+      </w:r>
+      <w:r>
+        <w:rPr/>
+        <w:t xml:space="preserve"> - o floare dintr-o comandă: cantitate și prețul unitar de la momentul comenzii (prețul florii se poate schimba ulterior, dar comanda trebuie să păstreze prețul plătit). </w:t>
+      </w:r>
+    </w:p>
+    <w:p>
+      <w:pPr>
+        <w:pStyle w:val="BodyText"/>
+        <w:bidi w:val="0"/>
+        <w:rPr/>
+      </w:pPr>
+      <w:r>
+        <w:rPr/>
+        <w:t>Relații: o comandă are mai multe linii (one-to-many); o floare poate apărea în mai multe linii de comandă (one-to-many). Practic, Comanda și Floare sunt în relație many-to-many, iar LinieComanda este tabelul asociativ cu atribute proprii.</w:t>
+      </w:r>
+    </w:p>
+    <w:p>
+      <w:pPr>
+        <w:pStyle w:val="BodyText"/>
+        <w:bidi w:val="0"/>
+        <w:rPr/>
+      </w:pPr>
+      <w:r>
+        <w:rPr/>
+        <w:t>Coșul este ținut în sesiune până la plasarea comenzii. Comanda se salvează într-o tranzacție: dacă un produs nu mai are stoc suficient, nu se salvează nimic, iar stocul scade doar pentru comenzile reușite.</w:t>
+      </w:r>
+    </w:p>
+    <w:p>
+      <w:pPr>
+        <w:pStyle w:val="Heading2"/>
+        <w:bidi w:val="0"/>
+        <w:rPr/>
+      </w:pPr>
+      <w:r>
+        <w:rPr/>
+        <w:t>4. Rularea proiectului</w:t>
+      </w:r>
+    </w:p>
+    <w:p>
+      <w:pPr>
+        <w:pStyle w:val="BodyText"/>
+        <w:numPr>
+          <w:ilvl w:val="0"/>
+          <w:numId w:val="5"/>
+        </w:numPr>
+        <w:tabs>
+          <w:tab w:val="clear" w:pos="1134"/>
+          <w:tab w:val="left" w:pos="709" w:leader="none"/>
+        </w:tabs>
+        <w:bidi w:val="0"/>
+        <w:spacing w:before="0" w:after="0"/>
+        <w:ind w:hanging="283" w:left="709"/>
+        <w:rPr/>
+      </w:pPr>
+      <w:r>
+        <w:rPr>
           <w:rStyle w:val="SourceText"/>
         </w:rPr>
         <w:t>python -m venv .venv</w:t>
@@ -1526,7 +1743,7 @@
         <w:pStyle w:val="BodyText"/>
         <w:numPr>
           <w:ilvl w:val="0"/>
-          <w:numId w:val="4"/>
+          <w:numId w:val="5"/>
         </w:numPr>
         <w:tabs>
           <w:tab w:val="clear" w:pos="1134"/>
@@ -1553,7 +1770,7 @@
         <w:pStyle w:val="BodyText"/>
         <w:numPr>
           <w:ilvl w:val="0"/>
-          <w:numId w:val="4"/>
+          <w:numId w:val="5"/>
         </w:numPr>
         <w:tabs>
           <w:tab w:val="clear" w:pos="1134"/>
@@ -1580,7 +1797,7 @@
         <w:pStyle w:val="BodyText"/>
         <w:numPr>
           <w:ilvl w:val="0"/>
-          <w:numId w:val="4"/>
+          <w:numId w:val="5"/>
         </w:numPr>
         <w:tabs>
           <w:tab w:val="clear" w:pos="1134"/>
@@ -1607,7 +1824,7 @@
         <w:pStyle w:val="BodyText"/>
         <w:numPr>
           <w:ilvl w:val="0"/>
-          <w:numId w:val="4"/>
+          <w:numId w:val="5"/>
         </w:numPr>
         <w:tabs>
           <w:tab w:val="clear" w:pos="1134"/>
@@ -1634,7 +1851,7 @@
         <w:pStyle w:val="BodyText"/>
         <w:numPr>
           <w:ilvl w:val="0"/>
-          <w:numId w:val="4"/>
+          <w:numId w:val="5"/>
         </w:numPr>
         <w:tabs>
           <w:tab w:val="clear" w:pos="1134"/>
@@ -1663,7 +1880,7 @@
       </w:pPr>
       <w:r>
         <w:rPr/>
-        <w:t>4. Bibliografie</w:t>
+        <w:t>5. Bibliografie</w:t>
       </w:r>
     </w:p>
     <w:p>
@@ -1671,7 +1888,7 @@
         <w:pStyle w:val="BodyText"/>
         <w:numPr>
           <w:ilvl w:val="0"/>
-          <w:numId w:val="5"/>
+          <w:numId w:val="6"/>
         </w:numPr>
         <w:tabs>
           <w:tab w:val="clear" w:pos="1134"/>
@@ -1692,7 +1909,7 @@
         <w:pStyle w:val="BodyText"/>
         <w:numPr>
           <w:ilvl w:val="0"/>
-          <w:numId w:val="5"/>
+          <w:numId w:val="6"/>
         </w:numPr>
         <w:tabs>
           <w:tab w:val="clear" w:pos="1134"/>
@@ -1713,7 +1930,7 @@
         <w:pStyle w:val="BodyText"/>
         <w:numPr>
           <w:ilvl w:val="0"/>
-          <w:numId w:val="5"/>
+          <w:numId w:val="6"/>
         </w:numPr>
         <w:tabs>
           <w:tab w:val="clear" w:pos="1134"/>
@@ -1734,7 +1951,7 @@
         <w:pStyle w:val="BodyText"/>
         <w:numPr>
           <w:ilvl w:val="0"/>
-          <w:numId w:val="5"/>
+          <w:numId w:val="6"/>
         </w:numPr>
         <w:tabs>
           <w:tab w:val="clear" w:pos="1134"/>
@@ -2179,8 +2396,8 @@
   <w:abstractNum w:abstractNumId="4">
     <w:lvl w:ilvl="0">
       <w:start w:val="1"/>
-      <w:numFmt w:val="decimal"/>
-      <w:lvlText w:val="%1."/>
+      <w:numFmt w:val="bullet"/>
+      <w:lvlText w:val=""/>
       <w:lvlJc w:val="left"/>
       <w:pPr>
         <w:tabs>
@@ -2188,12 +2405,14 @@
         </w:tabs>
         <w:ind w:left="709" w:hanging="283"/>
       </w:pPr>
-      <w:rPr/>
+      <w:rPr>
+        <w:rFonts w:ascii="Symbol" w:hAnsi="Symbol" w:cs="Symbol" w:hint="default"/>
+      </w:rPr>
     </w:lvl>
     <w:lvl w:ilvl="1">
       <w:start w:val="1"/>
-      <w:numFmt w:val="decimal"/>
-      <w:lvlText w:val="%2."/>
+      <w:numFmt w:val="bullet"/>
+      <w:lvlText w:val=""/>
       <w:lvlJc w:val="left"/>
       <w:pPr>
         <w:tabs>
@@ -2201,12 +2420,14 @@
         </w:tabs>
         <w:ind w:left="1418" w:hanging="283"/>
       </w:pPr>
-      <w:rPr/>
+      <w:rPr>
+        <w:rFonts w:ascii="Symbol" w:hAnsi="Symbol" w:cs="Symbol" w:hint="default"/>
+      </w:rPr>
     </w:lvl>
     <w:lvl w:ilvl="2">
       <w:start w:val="1"/>
-      <w:numFmt w:val="decimal"/>
-      <w:lvlText w:val="%3."/>
+      <w:numFmt w:val="bullet"/>
+      <w:lvlText w:val=""/>
       <w:lvlJc w:val="left"/>
       <w:pPr>
         <w:tabs>
@@ -2214,12 +2435,14 @@
         </w:tabs>
         <w:ind w:left="2127" w:hanging="283"/>
       </w:pPr>
-      <w:rPr/>
+      <w:rPr>
+        <w:rFonts w:ascii="Symbol" w:hAnsi="Symbol" w:cs="Symbol" w:hint="default"/>
+      </w:rPr>
     </w:lvl>
     <w:lvl w:ilvl="3">
       <w:start w:val="1"/>
-      <w:numFmt w:val="decimal"/>
-      <w:lvlText w:val="%4."/>
+      <w:numFmt w:val="bullet"/>
+      <w:lvlText w:val=""/>
       <w:lvlJc w:val="left"/>
       <w:pPr>
         <w:tabs>
@@ -2227,12 +2450,14 @@
         </w:tabs>
         <w:ind w:left="2836" w:hanging="283"/>
       </w:pPr>
-      <w:rPr/>
+      <w:rPr>
+        <w:rFonts w:ascii="Symbol" w:hAnsi="Symbol" w:cs="Symbol" w:hint="default"/>
+      </w:rPr>
     </w:lvl>
     <w:lvl w:ilvl="4">
       <w:start w:val="1"/>
-      <w:numFmt w:val="decimal"/>
-      <w:lvlText w:val="%5."/>
+      <w:numFmt w:val="bullet"/>
+      <w:lvlText w:val=""/>
       <w:lvlJc w:val="left"/>
       <w:pPr>
         <w:tabs>
@@ -2240,12 +2465,14 @@
         </w:tabs>
         <w:ind w:left="3545" w:hanging="283"/>
       </w:pPr>
-      <w:rPr/>
+      <w:rPr>
+        <w:rFonts w:ascii="Symbol" w:hAnsi="Symbol" w:cs="Symbol" w:hint="default"/>
+      </w:rPr>
     </w:lvl>
     <w:lvl w:ilvl="5">
       <w:start w:val="1"/>
-      <w:numFmt w:val="decimal"/>
-      <w:lvlText w:val="%6."/>
+      <w:numFmt w:val="bullet"/>
+      <w:lvlText w:val=""/>
       <w:lvlJc w:val="left"/>
       <w:pPr>
         <w:tabs>
@@ -2253,12 +2480,14 @@
         </w:tabs>
         <w:ind w:left="4254" w:hanging="283"/>
       </w:pPr>
-      <w:rPr/>
+      <w:rPr>
+        <w:rFonts w:ascii="Symbol" w:hAnsi="Symbol" w:cs="Symbol" w:hint="default"/>
+      </w:rPr>
     </w:lvl>
     <w:lvl w:ilvl="6">
       <w:start w:val="1"/>
-      <w:numFmt w:val="decimal"/>
-      <w:lvlText w:val="%7."/>
+      <w:numFmt w:val="bullet"/>
+      <w:lvlText w:val=""/>
       <w:lvlJc w:val="left"/>
       <w:pPr>
         <w:tabs>
@@ -2266,12 +2495,14 @@
         </w:tabs>
         <w:ind w:left="4963" w:hanging="283"/>
       </w:pPr>
-      <w:rPr/>
+      <w:rPr>
+        <w:rFonts w:ascii="Symbol" w:hAnsi="Symbol" w:cs="Symbol" w:hint="default"/>
+      </w:rPr>
     </w:lvl>
     <w:lvl w:ilvl="7">
       <w:start w:val="1"/>
-      <w:numFmt w:val="decimal"/>
-      <w:lvlText w:val="%8."/>
+      <w:numFmt w:val="bullet"/>
+      <w:lvlText w:val=""/>
       <w:lvlJc w:val="left"/>
       <w:pPr>
         <w:tabs>
@@ -2279,12 +2510,14 @@
         </w:tabs>
         <w:ind w:left="5672" w:hanging="283"/>
       </w:pPr>
-      <w:rPr/>
+      <w:rPr>
+        <w:rFonts w:ascii="Symbol" w:hAnsi="Symbol" w:cs="Symbol" w:hint="default"/>
+      </w:rPr>
     </w:lvl>
     <w:lvl w:ilvl="8">
       <w:start w:val="1"/>
-      <w:numFmt w:val="decimal"/>
-      <w:lvlText w:val="%9."/>
+      <w:numFmt w:val="bullet"/>
+      <w:lvlText w:val=""/>
       <w:lvlJc w:val="left"/>
       <w:pPr>
         <w:tabs>
@@ -2292,14 +2525,16 @@
         </w:tabs>
         <w:ind w:left="6381" w:hanging="283"/>
       </w:pPr>
-      <w:rPr/>
+      <w:rPr>
+        <w:rFonts w:ascii="Symbol" w:hAnsi="Symbol" w:cs="Symbol" w:hint="default"/>
+      </w:rPr>
     </w:lvl>
   </w:abstractNum>
   <w:abstractNum w:abstractNumId="5">
     <w:lvl w:ilvl="0">
       <w:start w:val="1"/>
-      <w:numFmt w:val="bullet"/>
-      <w:lvlText w:val=""/>
+      <w:numFmt w:val="decimal"/>
+      <w:lvlText w:val="%1."/>
       <w:lvlJc w:val="left"/>
       <w:pPr>
         <w:tabs>
@@ -2307,14 +2542,12 @@
         </w:tabs>
         <w:ind w:left="709" w:hanging="283"/>
       </w:pPr>
-      <w:rPr>
-        <w:rFonts w:ascii="Symbol" w:hAnsi="Symbol" w:cs="Symbol" w:hint="default"/>
-      </w:rPr>
+      <w:rPr/>
     </w:lvl>
     <w:lvl w:ilvl="1">
       <w:start w:val="1"/>
-      <w:numFmt w:val="bullet"/>
-      <w:lvlText w:val=""/>
+      <w:numFmt w:val="decimal"/>
+      <w:lvlText w:val="%2."/>
       <w:lvlJc w:val="left"/>
       <w:pPr>
         <w:tabs>
@@ -2322,14 +2555,12 @@
         </w:tabs>
         <w:ind w:left="1418" w:hanging="283"/>
       </w:pPr>
-      <w:rPr>
-        <w:rFonts w:ascii="Symbol" w:hAnsi="Symbol" w:cs="Symbol" w:hint="default"/>
-      </w:rPr>
+      <w:rPr/>
     </w:lvl>
     <w:lvl w:ilvl="2">
       <w:start w:val="1"/>
-      <w:numFmt w:val="bullet"/>
-      <w:lvlText w:val=""/>
+      <w:numFmt w:val="decimal"/>
+      <w:lvlText w:val="%3."/>
       <w:lvlJc w:val="left"/>
       <w:pPr>
         <w:tabs>
@@ -2337,14 +2568,12 @@
         </w:tabs>
         <w:ind w:left="2127" w:hanging="283"/>
       </w:pPr>
-      <w:rPr>
-        <w:rFonts w:ascii="Symbol" w:hAnsi="Symbol" w:cs="Symbol" w:hint="default"/>
-      </w:rPr>
+      <w:rPr/>
     </w:lvl>
     <w:lvl w:ilvl="3">
       <w:start w:val="1"/>
-      <w:numFmt w:val="bullet"/>
-      <w:lvlText w:val=""/>
+      <w:numFmt w:val="decimal"/>
+      <w:lvlText w:val="%4."/>
       <w:lvlJc w:val="left"/>
       <w:pPr>
         <w:tabs>
@@ -2352,14 +2581,12 @@
         </w:tabs>
         <w:ind w:left="2836" w:hanging="283"/>
       </w:pPr>
-      <w:rPr>
-        <w:rFonts w:ascii="Symbol" w:hAnsi="Symbol" w:cs="Symbol" w:hint="default"/>
-      </w:rPr>
+      <w:rPr/>
     </w:lvl>
     <w:lvl w:ilvl="4">
       <w:start w:val="1"/>
-      <w:numFmt w:val="bullet"/>
-      <w:lvlText w:val=""/>
+      <w:numFmt w:val="decimal"/>
+      <w:lvlText w:val="%5."/>
       <w:lvlJc w:val="left"/>
       <w:pPr>
         <w:tabs>
@@ -2367,14 +2594,12 @@
         </w:tabs>
         <w:ind w:left="3545" w:hanging="283"/>
       </w:pPr>
-      <w:rPr>
-        <w:rFonts w:ascii="Symbol" w:hAnsi="Symbol" w:cs="Symbol" w:hint="default"/>
-      </w:rPr>
+      <w:rPr/>
     </w:lvl>
     <w:lvl w:ilvl="5">
       <w:start w:val="1"/>
-      <w:numFmt w:val="bullet"/>
-      <w:lvlText w:val=""/>
+      <w:numFmt w:val="decimal"/>
+      <w:lvlText w:val="%6."/>
       <w:lvlJc w:val="left"/>
       <w:pPr>
         <w:tabs>
@@ -2382,14 +2607,12 @@
         </w:tabs>
         <w:ind w:left="4254" w:hanging="283"/>
       </w:pPr>
-      <w:rPr>
-        <w:rFonts w:ascii="Symbol" w:hAnsi="Symbol" w:cs="Symbol" w:hint="default"/>
-      </w:rPr>
+      <w:rPr/>
     </w:lvl>
     <w:lvl w:ilvl="6">
       <w:start w:val="1"/>
-      <w:numFmt w:val="bullet"/>
-      <w:lvlText w:val=""/>
+      <w:numFmt w:val="decimal"/>
+      <w:lvlText w:val="%7."/>
       <w:lvlJc w:val="left"/>
       <w:pPr>
         <w:tabs>
@@ -2397,14 +2620,12 @@
         </w:tabs>
         <w:ind w:left="4963" w:hanging="283"/>
       </w:pPr>
-      <w:rPr>
-        <w:rFonts w:ascii="Symbol" w:hAnsi="Symbol" w:cs="Symbol" w:hint="default"/>
-      </w:rPr>
+      <w:rPr/>
     </w:lvl>
     <w:lvl w:ilvl="7">
       <w:start w:val="1"/>
-      <w:numFmt w:val="bullet"/>
-      <w:lvlText w:val=""/>
+      <w:numFmt w:val="decimal"/>
+      <w:lvlText w:val="%8."/>
       <w:lvlJc w:val="left"/>
       <w:pPr>
         <w:tabs>
@@ -2412,14 +2633,12 @@
         </w:tabs>
         <w:ind w:left="5672" w:hanging="283"/>
       </w:pPr>
-      <w:rPr>
-        <w:rFonts w:ascii="Symbol" w:hAnsi="Symbol" w:cs="Symbol" w:hint="default"/>
-      </w:rPr>
+      <w:rPr/>
     </w:lvl>
     <w:lvl w:ilvl="8">
       <w:start w:val="1"/>
-      <w:numFmt w:val="bullet"/>
-      <w:lvlText w:val=""/>
+      <w:numFmt w:val="decimal"/>
+      <w:lvlText w:val="%9."/>
       <w:lvlJc w:val="left"/>
       <w:pPr>
         <w:tabs>
@@ -2427,12 +2646,147 @@
         </w:tabs>
         <w:ind w:left="6381" w:hanging="283"/>
       </w:pPr>
-      <w:rPr>
-        <w:rFonts w:ascii="Symbol" w:hAnsi="Symbol" w:cs="Symbol" w:hint="default"/>
-      </w:rPr>
+      <w:rPr/>
     </w:lvl>
   </w:abstractNum>
   <w:abstractNum w:abstractNumId="6">
+    <w:lvl w:ilvl="0">
+      <w:start w:val="1"/>
+      <w:numFmt w:val="bullet"/>
+      <w:lvlText w:val=""/>
+      <w:lvlJc w:val="left"/>
+      <w:pPr>
+        <w:tabs>
+          <w:tab w:val="num" w:pos="709"/>
+        </w:tabs>
+        <w:ind w:left="709" w:hanging="283"/>
+      </w:pPr>
+      <w:rPr>
+        <w:rFonts w:ascii="Symbol" w:hAnsi="Symbol" w:cs="Symbol" w:hint="default"/>
+      </w:rPr>
+    </w:lvl>
+    <w:lvl w:ilvl="1">
+      <w:start w:val="1"/>
+      <w:numFmt w:val="bullet"/>
+      <w:lvlText w:val=""/>
+      <w:lvlJc w:val="left"/>
+      <w:pPr>
+        <w:tabs>
+          <w:tab w:val="num" w:pos="1418"/>
+        </w:tabs>
+        <w:ind w:left="1418" w:hanging="283"/>
+      </w:pPr>
+      <w:rPr>
+        <w:rFonts w:ascii="Symbol" w:hAnsi="Symbol" w:cs="Symbol" w:hint="default"/>
+      </w:rPr>
+    </w:lvl>
+    <w:lvl w:ilvl="2">
+      <w:start w:val="1"/>
+      <w:numFmt w:val="bullet"/>
+      <w:lvlText w:val=""/>
+      <w:lvlJc w:val="left"/>
+      <w:pPr>
+        <w:tabs>
+          <w:tab w:val="num" w:pos="2127"/>
+        </w:tabs>
+        <w:ind w:left="2127" w:hanging="283"/>
+      </w:pPr>
+      <w:rPr>
+        <w:rFonts w:ascii="Symbol" w:hAnsi="Symbol" w:cs="Symbol" w:hint="default"/>
+      </w:rPr>
+    </w:lvl>
+    <w:lvl w:ilvl="3">
+      <w:start w:val="1"/>
+      <w:numFmt w:val="bullet"/>
+      <w:lvlText w:val=""/>
+      <w:lvlJc w:val="left"/>
+      <w:pPr>
+        <w:tabs>
+          <w:tab w:val="num" w:pos="2836"/>
+        </w:tabs>
+        <w:ind w:left="2836" w:hanging="283"/>
+      </w:pPr>
+      <w:rPr>
+        <w:rFonts w:ascii="Symbol" w:hAnsi="Symbol" w:cs="Symbol" w:hint="default"/>
+      </w:rPr>
+    </w:lvl>
+    <w:lvl w:ilvl="4">
+      <w:start w:val="1"/>
+      <w:numFmt w:val="bullet"/>
+      <w:lvlText w:val=""/>
+      <w:lvlJc w:val="left"/>
+      <w:pPr>
+        <w:tabs>
+          <w:tab w:val="num" w:pos="3545"/>
+        </w:tabs>
+        <w:ind w:left="3545" w:hanging="283"/>
+      </w:pPr>
+      <w:rPr>
+        <w:rFonts w:ascii="Symbol" w:hAnsi="Symbol" w:cs="Symbol" w:hint="default"/>
+      </w:rPr>
+    </w:lvl>
+    <w:lvl w:ilvl="5">
+      <w:start w:val="1"/>
+      <w:numFmt w:val="bullet"/>
+      <w:lvlText w:val=""/>
+      <w:lvlJc w:val="left"/>
+      <w:pPr>
+        <w:tabs>
+          <w:tab w:val="num" w:pos="4254"/>
+        </w:tabs>
+        <w:ind w:left="4254" w:hanging="283"/>
+      </w:pPr>
+      <w:rPr>
+        <w:rFonts w:ascii="Symbol" w:hAnsi="Symbol" w:cs="Symbol" w:hint="default"/>
+      </w:rPr>
+    </w:lvl>
+    <w:lvl w:ilvl="6">
+      <w:start w:val="1"/>
+      <w:numFmt w:val="bullet"/>
+      <w:lvlText w:val=""/>
+      <w:lvlJc w:val="left"/>
+      <w:pPr>
+        <w:tabs>
+          <w:tab w:val="num" w:pos="4963"/>
+        </w:tabs>
+        <w:ind w:left="4963" w:hanging="283"/>
+      </w:pPr>
+      <w:rPr>
+        <w:rFonts w:ascii="Symbol" w:hAnsi="Symbol" w:cs="Symbol" w:hint="default"/>
+      </w:rPr>
+    </w:lvl>
+    <w:lvl w:ilvl="7">
+      <w:start w:val="1"/>
+      <w:numFmt w:val="bullet"/>
+      <w:lvlText w:val=""/>
+      <w:lvlJc w:val="left"/>
+      <w:pPr>
+        <w:tabs>
+          <w:tab w:val="num" w:pos="5672"/>
+        </w:tabs>
+        <w:ind w:left="5672" w:hanging="283"/>
+      </w:pPr>
+      <w:rPr>
+        <w:rFonts w:ascii="Symbol" w:hAnsi="Symbol" w:cs="Symbol" w:hint="default"/>
+      </w:rPr>
+    </w:lvl>
+    <w:lvl w:ilvl="8">
+      <w:start w:val="1"/>
+      <w:numFmt w:val="bullet"/>
+      <w:lvlText w:val=""/>
+      <w:lvlJc w:val="left"/>
+      <w:pPr>
+        <w:tabs>
+          <w:tab w:val="num" w:pos="6381"/>
+        </w:tabs>
+        <w:ind w:left="6381" w:hanging="283"/>
+      </w:pPr>
+      <w:rPr>
+        <w:rFonts w:ascii="Symbol" w:hAnsi="Symbol" w:cs="Symbol" w:hint="default"/>
+      </w:rPr>
+    </w:lvl>
+  </w:abstractNum>
+  <w:abstractNum w:abstractNumId="7">
     <w:lvl w:ilvl="0">
       <w:start w:val="1"/>
       <w:numFmt w:val="none"/>
@@ -2570,6 +2924,9 @@
   </w:num>
   <w:num w:numId="6">
     <w:abstractNumId w:val="6"/>
+  </w:num>
+  <w:num w:numId="7">
+    <w:abstractNumId w:val="7"/>
   </w:num>
 </w:numbering>
 </file>

</xml_diff>

<commit_message>
Cont admin creat automat la migrate; carduri de produs clickabile cu buton Adauga in cos
</commit_message>
<xml_diff>
--- a/docs/documentatie.docx
+++ b/docs/documentatie.docx
@@ -1836,10 +1836,34 @@
         <w:rPr/>
       </w:pPr>
       <w:r>
+        <w:rPr/>
+        <w:t xml:space="preserve">contul de administrare </w:t>
+      </w:r>
+      <w:r>
         <w:rPr>
           <w:rStyle w:val="SourceText"/>
         </w:rPr>
-        <w:t>.venv/bin/python manage.py createsuperuser</w:t>
+        <w:t>admin</w:t>
+      </w:r>
+      <w:r>
+        <w:rPr/>
+        <w:t xml:space="preserve"> (parola </w:t>
+      </w:r>
+      <w:r>
+        <w:rPr>
+          <w:rStyle w:val="SourceText"/>
+        </w:rPr>
+        <w:t>password</w:t>
+      </w:r>
+      <w:r>
+        <w:rPr/>
+        <w:t xml:space="preserve">) se creează automat la </w:t>
+      </w:r>
+      <w:r>
+        <w:rPr>
+          <w:rStyle w:val="SourceText"/>
+        </w:rPr>
+        <w:t>migrate</w:t>
       </w:r>
       <w:r>
         <w:rPr/>

</xml_diff>

<commit_message>
Fotografii reale ale florilor (Wikimedia Commons, licente libere) si sursele lor
</commit_message>
<xml_diff>
--- a/docs/documentatie.docx
+++ b/docs/documentatie.docx
@@ -1982,13 +1982,358 @@
           <w:tab w:val="left" w:pos="709" w:leader="none"/>
         </w:tabs>
         <w:bidi w:val="0"/>
+        <w:spacing w:before="0" w:after="0"/>
+        <w:ind w:hanging="283" w:left="709"/>
+        <w:rPr/>
+      </w:pPr>
+      <w:r>
+        <w:rPr/>
+        <w:t xml:space="preserve">Imaginile din paginile site-ului (fundal, buchet, magazin) sunt desene proprii (SVG). </w:t>
+      </w:r>
+    </w:p>
+    <w:p>
+      <w:pPr>
+        <w:pStyle w:val="BodyText"/>
+        <w:numPr>
+          <w:ilvl w:val="0"/>
+          <w:numId w:val="6"/>
+        </w:numPr>
+        <w:tabs>
+          <w:tab w:val="clear" w:pos="1134"/>
+          <w:tab w:val="left" w:pos="709" w:leader="none"/>
+        </w:tabs>
+        <w:bidi w:val="0"/>
+        <w:spacing w:before="0" w:after="0"/>
+        <w:ind w:hanging="283" w:left="709"/>
+        <w:rPr/>
+      </w:pPr>
+      <w:r>
+        <w:rPr/>
+        <w:t xml:space="preserve">Fotografiile produselor sunt de pe Wikimedia Commons, cu licențe libere: </w:t>
+      </w:r>
+    </w:p>
+    <w:p>
+      <w:pPr>
+        <w:pStyle w:val="BodyText"/>
+        <w:numPr>
+          <w:ilvl w:val="1"/>
+          <w:numId w:val="6"/>
+        </w:numPr>
+        <w:tabs>
+          <w:tab w:val="clear" w:pos="1134"/>
+          <w:tab w:val="left" w:pos="1418" w:leader="none"/>
+        </w:tabs>
+        <w:bidi w:val="0"/>
+        <w:spacing w:before="0" w:after="0"/>
+        <w:ind w:hanging="283" w:left="1418"/>
+        <w:rPr/>
+      </w:pPr>
+      <w:r>
+        <w:rPr>
+          <w:rStyle w:val="SourceText"/>
+        </w:rPr>
+        <w:t>trandafiri-rosii.jpg</w:t>
+      </w:r>
+      <w:r>
+        <w:rPr/>
+        <w:t xml:space="preserve">: Montanabw, „Red roses from bouquet 2.jpg”, Wikimedia Commons, CC BY-SA 4.0 (https://commons.wikimedia.org/wiki/File:Red_roses_from_bouquet_2.jpg) </w:t>
+      </w:r>
+    </w:p>
+    <w:p>
+      <w:pPr>
+        <w:pStyle w:val="BodyText"/>
+        <w:numPr>
+          <w:ilvl w:val="1"/>
+          <w:numId w:val="6"/>
+        </w:numPr>
+        <w:tabs>
+          <w:tab w:val="clear" w:pos="1134"/>
+          <w:tab w:val="left" w:pos="1418" w:leader="none"/>
+        </w:tabs>
+        <w:bidi w:val="0"/>
+        <w:spacing w:before="0" w:after="0"/>
+        <w:ind w:hanging="283" w:left="1418"/>
+        <w:rPr/>
+      </w:pPr>
+      <w:r>
+        <w:rPr>
+          <w:rStyle w:val="SourceText"/>
+        </w:rPr>
+        <w:t>trandafiri-albi.jpg</w:t>
+      </w:r>
+      <w:r>
+        <w:rPr/>
+        <w:t xml:space="preserve">: Ruth Hartnup from Vancouver, Canada, „Bouquet of white roses (2486808368).jpg”, Wikimedia Commons, CC BY 2.0 (https://commons.wikimedia.org/wiki/File:Bouquet_of_white_roses_(2486808368).jpg) </w:t>
+      </w:r>
+    </w:p>
+    <w:p>
+      <w:pPr>
+        <w:pStyle w:val="BodyText"/>
+        <w:numPr>
+          <w:ilvl w:val="1"/>
+          <w:numId w:val="6"/>
+        </w:numPr>
+        <w:tabs>
+          <w:tab w:val="clear" w:pos="1134"/>
+          <w:tab w:val="left" w:pos="1418" w:leader="none"/>
+        </w:tabs>
+        <w:bidi w:val="0"/>
+        <w:spacing w:before="0" w:after="0"/>
+        <w:ind w:hanging="283" w:left="1418"/>
+        <w:rPr/>
+      </w:pPr>
+      <w:r>
+        <w:rPr>
+          <w:rStyle w:val="SourceText"/>
+        </w:rPr>
+        <w:t>trandafir-roz-la-fir.jpg</w:t>
+      </w:r>
+      <w:r>
+        <w:rPr/>
+        <w:t xml:space="preserve">: Сарапулов, „Троянда сорту Pink Intuition 02.jpg”, Wikimedia Commons, CC BY 4.0 (https://commons.wikimedia.org/wiki/File:%D0%A2%D1%80%D0%BE%D1%8F%D0%BD%D0%B4%D0%B0_%D1%81%D0%BE%D1%80%D1%82%D1%83_Pink_Intuition_02.jpg) </w:t>
+      </w:r>
+    </w:p>
+    <w:p>
+      <w:pPr>
+        <w:pStyle w:val="BodyText"/>
+        <w:numPr>
+          <w:ilvl w:val="1"/>
+          <w:numId w:val="6"/>
+        </w:numPr>
+        <w:tabs>
+          <w:tab w:val="clear" w:pos="1134"/>
+          <w:tab w:val="left" w:pos="1418" w:leader="none"/>
+        </w:tabs>
+        <w:bidi w:val="0"/>
+        <w:spacing w:before="0" w:after="0"/>
+        <w:ind w:hanging="283" w:left="1418"/>
+        <w:rPr/>
+      </w:pPr>
+      <w:r>
+        <w:rPr>
+          <w:rStyle w:val="SourceText"/>
+        </w:rPr>
+        <w:t>lalele-mixte.jpg</w:t>
+      </w:r>
+      <w:r>
+        <w:rPr/>
+        <w:t xml:space="preserve">: Gábor Juhász juhg, „Tulip-bouquet-vienna (Unsplash).jpg”, Wikimedia Commons, CC0 (https://commons.wikimedia.org/wiki/File:Tulip-bouquet-vienna_(Unsplash).jpg) </w:t>
+      </w:r>
+    </w:p>
+    <w:p>
+      <w:pPr>
+        <w:pStyle w:val="BodyText"/>
+        <w:numPr>
+          <w:ilvl w:val="1"/>
+          <w:numId w:val="6"/>
+        </w:numPr>
+        <w:tabs>
+          <w:tab w:val="clear" w:pos="1134"/>
+          <w:tab w:val="left" w:pos="1418" w:leader="none"/>
+        </w:tabs>
+        <w:bidi w:val="0"/>
+        <w:spacing w:before="0" w:after="0"/>
+        <w:ind w:hanging="283" w:left="1418"/>
+        <w:rPr/>
+      </w:pPr>
+      <w:r>
+        <w:rPr>
+          <w:rStyle w:val="SourceText"/>
+        </w:rPr>
+        <w:t>lalele-albe.jpg</w:t>
+      </w:r>
+      <w:r>
+        <w:rPr/>
+        <w:t xml:space="preserve">: George E. Koronaios, „White tulips on a black table.jpg”, Wikimedia Commons, CC BY-SA 4.0 (https://commons.wikimedia.org/wiki/File:White_tulips_on_a_black_table.jpg) </w:t>
+      </w:r>
+    </w:p>
+    <w:p>
+      <w:pPr>
+        <w:pStyle w:val="BodyText"/>
+        <w:numPr>
+          <w:ilvl w:val="1"/>
+          <w:numId w:val="6"/>
+        </w:numPr>
+        <w:tabs>
+          <w:tab w:val="clear" w:pos="1134"/>
+          <w:tab w:val="left" w:pos="1418" w:leader="none"/>
+        </w:tabs>
+        <w:bidi w:val="0"/>
+        <w:spacing w:before="0" w:after="0"/>
+        <w:ind w:hanging="283" w:left="1418"/>
+        <w:rPr/>
+      </w:pPr>
+      <w:r>
+        <w:rPr>
+          <w:rStyle w:val="SourceText"/>
+        </w:rPr>
+        <w:t>orhidee-phalaenopsis.jpg</w:t>
+      </w:r>
+      <w:r>
+        <w:rPr/>
+        <w:t xml:space="preserve">: Timm Schoof, „Pot Orchid (124213019).jpeg”, Wikimedia Commons, CC BY-SA 3.0 (https://commons.wikimedia.org/wiki/File:Pot_Orchid_(124213019).jpeg) </w:t>
+      </w:r>
+    </w:p>
+    <w:p>
+      <w:pPr>
+        <w:pStyle w:val="BodyText"/>
+        <w:numPr>
+          <w:ilvl w:val="1"/>
+          <w:numId w:val="6"/>
+        </w:numPr>
+        <w:tabs>
+          <w:tab w:val="clear" w:pos="1134"/>
+          <w:tab w:val="left" w:pos="1418" w:leader="none"/>
+        </w:tabs>
+        <w:bidi w:val="0"/>
+        <w:spacing w:before="0" w:after="0"/>
+        <w:ind w:hanging="283" w:left="1418"/>
+        <w:rPr/>
+      </w:pPr>
+      <w:r>
+        <w:rPr>
+          <w:rStyle w:val="SourceText"/>
+        </w:rPr>
+        <w:t>ficus-benjamina.jpg</w:t>
+      </w:r>
+      <w:r>
+        <w:rPr/>
+        <w:t xml:space="preserve">: ToprakM, „Ficus benjamina at University of Kyrenia.jpg”, Wikimedia Commons, CC BY 4.0 (https://commons.wikimedia.org/wiki/File:Ficus_benjamina_at_University_of_Kyrenia.jpg) </w:t>
+      </w:r>
+    </w:p>
+    <w:p>
+      <w:pPr>
+        <w:pStyle w:val="BodyText"/>
+        <w:numPr>
+          <w:ilvl w:val="1"/>
+          <w:numId w:val="6"/>
+        </w:numPr>
+        <w:tabs>
+          <w:tab w:val="clear" w:pos="1134"/>
+          <w:tab w:val="left" w:pos="1418" w:leader="none"/>
+        </w:tabs>
+        <w:bidi w:val="0"/>
+        <w:spacing w:before="0" w:after="0"/>
+        <w:ind w:hanging="283" w:left="1418"/>
+        <w:rPr/>
+      </w:pPr>
+      <w:r>
+        <w:rPr>
+          <w:rStyle w:val="SourceText"/>
+        </w:rPr>
+        <w:t>spathiphyllum.jpg</w:t>
+      </w:r>
+      <w:r>
+        <w:rPr/>
+        <w:t xml:space="preserve">: VPaleontologist, „A spathiphyllum 02.jpg”, Wikimedia Commons, CC BY-SA 4.0 (https://commons.wikimedia.org/wiki/File:A_spathiphyllum_02.jpg) </w:t>
+      </w:r>
+    </w:p>
+    <w:p>
+      <w:pPr>
+        <w:pStyle w:val="BodyText"/>
+        <w:numPr>
+          <w:ilvl w:val="1"/>
+          <w:numId w:val="6"/>
+        </w:numPr>
+        <w:tabs>
+          <w:tab w:val="clear" w:pos="1134"/>
+          <w:tab w:val="left" w:pos="1418" w:leader="none"/>
+        </w:tabs>
+        <w:bidi w:val="0"/>
+        <w:spacing w:before="0" w:after="0"/>
+        <w:ind w:hanging="283" w:left="1418"/>
+        <w:rPr/>
+      </w:pPr>
+      <w:r>
+        <w:rPr>
+          <w:rStyle w:val="SourceText"/>
+        </w:rPr>
+        <w:t>aranjament-de-camp.jpg</w:t>
+      </w:r>
+      <w:r>
+        <w:rPr/>
+        <w:t xml:space="preserve">: Gerda Arendt, „Bouquet of wildflowers, Ehrenbach.jpg”, Wikimedia Commons, CC0 (https://commons.wikimedia.org/wiki/File:Bouquet_of_wildflowers,_Ehrenbach.jpg) </w:t>
+      </w:r>
+    </w:p>
+    <w:p>
+      <w:pPr>
+        <w:pStyle w:val="BodyText"/>
+        <w:numPr>
+          <w:ilvl w:val="1"/>
+          <w:numId w:val="6"/>
+        </w:numPr>
+        <w:tabs>
+          <w:tab w:val="clear" w:pos="1134"/>
+          <w:tab w:val="left" w:pos="1418" w:leader="none"/>
+        </w:tabs>
+        <w:bidi w:val="0"/>
+        <w:spacing w:before="0" w:after="0"/>
+        <w:ind w:hanging="283" w:left="1418"/>
+        <w:rPr/>
+      </w:pPr>
+      <w:r>
+        <w:rPr>
+          <w:rStyle w:val="SourceText"/>
+        </w:rPr>
+        <w:t>floarea-soarelui.jpg</w:t>
+      </w:r>
+      <w:r>
+        <w:rPr/>
+        <w:t xml:space="preserve">: Alabama Extension, „Sunflowers for Sale at Farmers Market.jpg”, Wikimedia Commons, CC0 (https://commons.wikimedia.org/wiki/File:Sunflowers_for_Sale_at_Farmers_Market.jpg) </w:t>
+      </w:r>
+    </w:p>
+    <w:p>
+      <w:pPr>
+        <w:pStyle w:val="BodyText"/>
+        <w:numPr>
+          <w:ilvl w:val="1"/>
+          <w:numId w:val="6"/>
+        </w:numPr>
+        <w:tabs>
+          <w:tab w:val="clear" w:pos="1134"/>
+          <w:tab w:val="left" w:pos="1418" w:leader="none"/>
+        </w:tabs>
+        <w:bidi w:val="0"/>
+        <w:spacing w:before="0" w:after="0"/>
+        <w:ind w:hanging="283" w:left="1418"/>
+        <w:rPr/>
+      </w:pPr>
+      <w:r>
+        <w:rPr>
+          <w:rStyle w:val="SourceText"/>
+        </w:rPr>
+        <w:t>crizanteme-portocalii.jpg</w:t>
+      </w:r>
+      <w:r>
+        <w:rPr/>
+        <w:t xml:space="preserve">: Jonathan Billinger, „Orange-bronze Chrysanthemum - geograph.org.uk - 4233680.jpg”, Wikimedia Commons, CC BY-SA 2.0 (https://commons.wikimedia.org/wiki/File:Orange-bronze_Chrysanthemum_-_geograph.org.uk_-_4233680.jpg) </w:t>
+      </w:r>
+    </w:p>
+    <w:p>
+      <w:pPr>
+        <w:pStyle w:val="BodyText"/>
+        <w:numPr>
+          <w:ilvl w:val="1"/>
+          <w:numId w:val="6"/>
+        </w:numPr>
+        <w:tabs>
+          <w:tab w:val="clear" w:pos="1134"/>
+          <w:tab w:val="left" w:pos="1418" w:leader="none"/>
+        </w:tabs>
+        <w:bidi w:val="0"/>
         <w:spacing w:before="0" w:after="283"/>
-        <w:ind w:hanging="283" w:left="709"/>
-        <w:rPr/>
-      </w:pPr>
-      <w:r>
-        <w:rPr/>
-        <w:t xml:space="preserve">Imaginile site-ului și ale produselor sunt desene proprii (SVG/PNG generate pentru proiect). </w:t>
+        <w:ind w:hanging="283" w:left="1418"/>
+        <w:rPr/>
+      </w:pPr>
+      <w:r>
+        <w:rPr>
+          <w:rStyle w:val="SourceText"/>
+        </w:rPr>
+        <w:t>aranjament-de-toamna.jpg</w:t>
+      </w:r>
+      <w:r>
+        <w:rPr/>
+        <w:t xml:space="preserve">: Mikismom, „Early fall flower arrangements.jpg”, Wikimedia Commons, CC BY-SA 4.0 (https://commons.wikimedia.org/wiki/File:Early_fall_flower_arrangements.jpg) </w:t>
       </w:r>
     </w:p>
     <w:sectPr>

</xml_diff>

<commit_message>
Florăria se numește Buchetul; siglă nouă în meniu și ca iconiță
</commit_message>
<xml_diff>
--- a/docs/documentatie.docx
+++ b/docs/documentatie.docx
@@ -26,18 +26,18 @@
         <w:rPr>
           <w:b/>
         </w:rPr>
-        <w:t>Tema proiectului: Florăria Petale - magazin online de flori</w:t>
-      </w:r>
-    </w:p>
-    <w:p>
-      <w:pPr>
-        <w:pStyle w:val="BodyText"/>
-        <w:bidi w:val="0"/>
-        <w:rPr/>
-      </w:pPr>
-      <w:r>
-        <w:rPr/>
-        <w:t>Florăria Petale este un site comercial care vinde flori: buchete, aranjamente florale, flori la fir și plante la ghiveci. Florile sunt organizate pe categorii (trandafiri, lalele, plante la ghiveci etc.) și pot fi asociate cu ocazii (zi de naștere, nuntă, 1 și 8 Martie etc.). Clienții vor putea căuta, filtra și sorta florile după categorie, ocazie, preț sau culoare, vor putea vedea pagina fiecărui produs și vor putea plasa o comandă simplă prin coșul virtual. Firma are mai multe sedii (florării), fiecare cu raioanele lui, și colaborează cu mai mulți furnizori.</w:t>
+        <w:t>Tema proiectului: Buchetul - florărie online</w:t>
+      </w:r>
+    </w:p>
+    <w:p>
+      <w:pPr>
+        <w:pStyle w:val="BodyText"/>
+        <w:bidi w:val="0"/>
+        <w:rPr/>
+      </w:pPr>
+      <w:r>
+        <w:rPr/>
+        <w:t>Buchetul este un site comercial care vinde flori: buchete, aranjamente florale, flori la fir și plante la ghiveci. Florile sunt organizate pe categorii (trandafiri, lalele, plante la ghiveci etc.) și pot fi asociate cu ocazii (zi de naștere, nuntă, 1 și 8 Martie etc.). Clienții vor putea căuta, filtra și sorta florile după categorie, ocazie, preț sau culoare, vor putea vedea pagina fiecărui produs și vor putea plasa o comandă simplă prin coșul virtual. Firma are mai multe sedii (florării), fiecare cu raioanele lui, și colaborează cu mai mulți furnizori.</w:t>
       </w:r>
     </w:p>
     <w:p>

</xml_diff>